<commit_message>
docs: add segment based TO-BE practice plans
</commit_message>
<xml_diff>
--- a/07_교육과제/팀과제/2026/09/BI시각화_34일차_2팀_기초실습_문제-2_20260904_v01_제출본.docx
+++ b/07_교육과제/팀과제/2026/09/BI시각화_34일차_2팀_기초실습_문제-2_20260904_v01_제출본.docx
@@ -2513,6 +2513,7 @@
                 <w:color w:val="222222"/>
                 <w:sz w:val="19"/>
               </w:rPr>
+              <w:t>[카드 A] 0건 화면에 가격 범위 확대·최소 평점 하향·편의시설 일부 해제 선택지를 동등하게 제공한다. 적용 후 2주간 선택지별 노출 수·선택 수·조건 변경률·변경 후 결과 회복률을 관찰하고, 선택지 간 차이가 확인되면 후속 A/B 테스트로 노출 순서와 표현 방식을 검증한다.</w:t>
             </w:r>
             <w:r>
               <w:rPr>
@@ -2521,7 +2522,6 @@
                 <w:color w:val="222222"/>
                 <w:sz w:val="19"/>
               </w:rPr>
-              <w:t xml:space="preserve">[카드 A] </w:t>
             </w:r>
             <w:r>
               <w:rPr>
@@ -2530,7 +2530,6 @@
                 <w:color w:val="222222"/>
                 <w:sz w:val="19"/>
               </w:rPr>
-              <w:t>0건 화면에 가격 범위 확대·최소 평점 하향·편의시설 일부 해제 선택지를 동등하게 제공하고, 적용 후 2주간 조건 변경률과 조건 완화 후 결과 회복률을 확인한다.</w:t>
             </w:r>
           </w:p>
           <w:p>
@@ -3323,6 +3322,7 @@
                 <w:color w:val="222222"/>
                 <w:sz w:val="19"/>
               </w:rPr>
+              <w:t>[카드 A] 신규 추천 데이터 없이 1차 관찰형 파일럿을 시작할 수 있다. 2주간 선택지별 노출·선택·조건 변경·결과 회복을 확인하고, 차이가 관측될 때만 후속 A/B 테스트로 순서와 문구를 최적화한다.</w:t>
             </w:r>
             <w:r>
               <w:rPr>
@@ -3331,7 +3331,6 @@
                 <w:color w:val="222222"/>
                 <w:sz w:val="19"/>
               </w:rPr>
-              <w:t xml:space="preserve">[카드 A] </w:t>
             </w:r>
             <w:r>
               <w:rPr>
@@ -3340,7 +3339,6 @@
                 <w:color w:val="222222"/>
                 <w:sz w:val="19"/>
               </w:rPr>
-              <w:t>근거와 측정 데이터가 있으며 신규 추천 데이터 없이 시작할 수 있다. 2주 측정 후 유지·수정 여부를 판단한다.</w:t>
             </w:r>
           </w:p>
           <w:p>
@@ -4083,7 +4081,7 @@
                 <w:color w:val="222222"/>
                 <w:sz w:val="19"/>
               </w:rPr>
-              <w:t xml:space="preserve">결정: </w:t>
+              <w:t>결정: 선택지별 노출 수·선택 수·조건 변경 수·결과 회복 수를 함께 관찰한다. 선택지 간 차이가 확인되면 후속 A/B 테스트로 노출 순서와 표현 방식을 검증하며, 사전 근거 없는 목표치는 두지 않는다.</w:t>
             </w:r>
             <w:r>
               <w:rPr>
@@ -4092,7 +4090,6 @@
                 <w:color w:val="222222"/>
                 <w:sz w:val="19"/>
               </w:rPr>
-              <w:t>조건별 노출 수·변경 수·회복 수를 함께 보고 선택지 유지, 문구 수정, 후속 실험 여부를 정한다. 사전 목표치는 두지 않는다.</w:t>
             </w:r>
           </w:p>
         </w:tc>
@@ -5597,7 +5594,7 @@
                 <w:color w:val="222222"/>
                 <w:sz w:val="19"/>
               </w:rPr>
-              <w:t>실행 — 정적 조건 완화 선택지를 적용하고 2주간 조건 변경률·결과 회복률을 측정한다.</w:t>
+              <w:t>실행 — 정적 조건 완화 선택지를 동등하게 제공해 2주간 관찰하고, 선택지 간 차이가 확인되면 후속 A/B 테스트를 실시한다.</w:t>
             </w:r>
           </w:p>
         </w:tc>

</xml_diff>